<commit_message>
feat: document verified Abbott internship impact
</commit_message>
<xml_diff>
--- a/public/resume/generated/rahul-mitra-ai-engineer-2026-08.docx
+++ b/public/resume/generated/rahul-mitra-ai-engineer-2026-08.docx
@@ -162,6 +162,7 @@
     </w:p>
     <w:p>
       <w:pPr>
+        <w:keepNext/>
         <w:tabs>
           <w:tab w:pos="9576" w:val="right"/>
         </w:tabs>
@@ -223,6 +224,7 @@
     </w:p>
     <w:p>
       <w:pPr>
+        <w:keepNext/>
         <w:tabs>
           <w:tab w:pos="9576" w:val="right"/>
         </w:tabs>
@@ -277,6 +279,7 @@
     </w:p>
     <w:p>
       <w:pPr>
+        <w:keepNext/>
         <w:tabs>
           <w:tab w:pos="9576" w:val="right"/>
         </w:tabs>
@@ -314,6 +317,7 @@
     </w:p>
     <w:p>
       <w:pPr>
+        <w:keepNext/>
         <w:tabs>
           <w:tab w:pos="9576" w:val="right"/>
         </w:tabs>
@@ -346,7 +350,7 @@
         <w:rPr>
           <w:sz w:val="17"/>
         </w:rPr>
-        <w:t xml:space="preserve">- Built a Python digital twin simulation and constraint-programming optimizer for an NP-hard hybrid flow shop scheduling problem, translating production complexity into decision-ready schedules.</w:t>
+        <w:t>- Built a SimPy discrete-event digital twin and CP-SAT optimizer for hybrid flow-shop scheduling; engineered a 15-stage changeover-data pipeline that handled human- and machine-generated errors and processed five years of unseen raw data without errors.</w:t>
       </w:r>
     </w:p>
     <w:p>
@@ -358,11 +362,12 @@
         <w:rPr>
           <w:sz w:val="17"/>
         </w:rPr>
-        <w:t xml:space="preserve">- Architected an Azure-based web simulator for Advanced Process Control systems across global manufacturing plants, using Docker containerization and Bitbucket CI/CD for repeatable releases.</w:t>
+        <w:t>- Productionized and operated a team-built APC simulator for live internal manufacturing and engineer-training users as a Docker container on Azure App Service; delivered practical AI upskilling to the regional engineering workforce.</w:t>
       </w:r>
     </w:p>
     <w:p>
       <w:pPr>
+        <w:keepNext/>
         <w:tabs>
           <w:tab w:pos="9576" w:val="right"/>
         </w:tabs>
@@ -441,6 +446,7 @@
     </w:p>
     <w:p>
       <w:pPr>
+        <w:keepNext/>
         <w:tabs>
           <w:tab w:pos="9576" w:val="right"/>
         </w:tabs>
@@ -478,6 +484,7 @@
     </w:p>
     <w:p>
       <w:pPr>
+        <w:keepNext/>
         <w:tabs>
           <w:tab w:pos="9576" w:val="right"/>
         </w:tabs>
@@ -515,6 +522,7 @@
     </w:p>
     <w:p>
       <w:pPr>
+        <w:keepNext/>
         <w:tabs>
           <w:tab w:pos="9576" w:val="right"/>
         </w:tabs>
@@ -552,6 +560,7 @@
     </w:p>
     <w:p>
       <w:pPr>
+        <w:keepNext/>
         <w:tabs>
           <w:tab w:pos="9576" w:val="right"/>
         </w:tabs>
@@ -589,6 +598,7 @@
     </w:p>
     <w:p>
       <w:pPr>
+        <w:keepNext/>
         <w:tabs>
           <w:tab w:pos="9576" w:val="right"/>
         </w:tabs>
@@ -643,6 +653,7 @@
     </w:p>
     <w:p>
       <w:pPr>
+        <w:keepNext/>
         <w:spacing w:after="30"/>
       </w:pPr>
       <w:r>
@@ -697,6 +708,7 @@
     </w:p>
     <w:p>
       <w:pPr>
+        <w:keepNext/>
         <w:tabs>
           <w:tab w:pos="9576" w:val="right"/>
         </w:tabs>
@@ -734,6 +746,7 @@
     </w:p>
     <w:p>
       <w:pPr>
+        <w:keepNext/>
         <w:tabs>
           <w:tab w:pos="9576" w:val="right"/>
         </w:tabs>

</xml_diff>

<commit_message>
refine Abbott resume experience
</commit_message>
<xml_diff>
--- a/public/resume/generated/rahul-mitra-ai-engineer-2026-08.docx
+++ b/public/resume/generated/rahul-mitra-ai-engineer-2026-08.docx
@@ -291,7 +291,7 @@
           <w:color w:val="111827"/>
           <w:sz w:val="18"/>
         </w:rPr>
-        <w:t xml:space="preserve">Operational AI Systems &amp; Data Engineer (Contract), Abbott Laboratories Singapore Pte Ltd</w:t>
+        <w:t>Operational AI Systems &amp; Data Engineer (Contract), Abbott Laboratories</w:t>
       </w:r>
       <w:r>
         <w:rPr>
@@ -329,7 +329,7 @@
           <w:color w:val="111827"/>
           <w:sz w:val="18"/>
         </w:rPr>
-        <w:t xml:space="preserve">Data Analytics and Project/Product Management Intern, Abbott Laboratories Singapore Pte Ltd</w:t>
+        <w:t>Data Analytics and Project/Product Management Intern, Abbott Laboratories</w:t>
       </w:r>
       <w:r>
         <w:rPr>
@@ -350,7 +350,7 @@
         <w:rPr>
           <w:sz w:val="17"/>
         </w:rPr>
-        <w:t>- Built a SimPy discrete-event digital twin and CP-SAT optimizer for hybrid flow-shop scheduling; engineered a 15-stage changeover-data pipeline that handled human- and machine-generated errors and processed five years of unseen raw data without errors.</w:t>
+        <w:t>- Developed a SimPy discrete-event digital twin and OR-Tools CP-SAT optimizer for hybrid flow-shop scheduling, translating production objectives and constraints into decision-ready schedules.</w:t>
       </w:r>
     </w:p>
     <w:p>
@@ -362,7 +362,31 @@
         <w:rPr>
           <w:sz w:val="17"/>
         </w:rPr>
-        <w:t>- Productionized and operated a team-built APC simulator for live internal manufacturing and engineer-training users as a Docker container on Azure App Service; delivered practical AI upskilling to the regional engineering workforce.</w:t>
+        <w:t>- Engineered a non-destructive, 15-stage changeover-data pipeline to normalize operator- and machine-generated anomalies, validating it against five years of previously unseen raw data with zero execution failures.</w:t>
+      </w:r>
+    </w:p>
+    <w:p>
+      <w:pPr>
+        <w:spacing w:after="7" w:line="240" w:lineRule="auto"/>
+        <w:ind w:left="230" w:hanging="173"/>
+      </w:pPr>
+      <w:r>
+        <w:rPr>
+          <w:sz w:val="17"/>
+        </w:rPr>
+        <w:t>- Productionized and supported a team-built APC simulator for live manufacturing and engineer training by packaging it in Docker and deploying it to Azure App Service.</w:t>
+      </w:r>
+    </w:p>
+    <w:p>
+      <w:pPr>
+        <w:spacing w:after="7" w:line="240" w:lineRule="auto"/>
+        <w:ind w:left="230" w:hanging="173"/>
+      </w:pPr>
+      <w:r>
+        <w:rPr>
+          <w:sz w:val="17"/>
+        </w:rPr>
+        <w:t>- Delivered practical AI upskilling to the regional engineering workforce for day-to-day operational use.</w:t>
       </w:r>
     </w:p>
     <w:p>

</xml_diff>